<commit_message>
update on 2025-06-17 22:28:17.625111
</commit_message>
<xml_diff>
--- a/py 系统交互.docx
+++ b/py 系统交互.docx
@@ -185,12 +185,6 @@
             <w:insideH w:val="single" w:color="auto" w:sz="4" w:space="0"/>
             <w:insideV w:val="single" w:color="auto" w:sz="4" w:space="0"/>
           </w:tblBorders>
-          <w:tblCellMar>
-            <w:top w:w="0" w:type="dxa"/>
-            <w:left w:w="108" w:type="dxa"/>
-            <w:bottom w:w="0" w:type="dxa"/>
-            <w:right w:w="108" w:type="dxa"/>
-          </w:tblCellMar>
         </w:tblPrEx>
         <w:tc>
           <w:tcPr>
@@ -342,12 +336,6 @@
             <w:insideH w:val="single" w:color="auto" w:sz="4" w:space="0"/>
             <w:insideV w:val="single" w:color="auto" w:sz="4" w:space="0"/>
           </w:tblBorders>
-          <w:tblCellMar>
-            <w:top w:w="0" w:type="dxa"/>
-            <w:left w:w="108" w:type="dxa"/>
-            <w:bottom w:w="0" w:type="dxa"/>
-            <w:right w:w="108" w:type="dxa"/>
-          </w:tblCellMar>
         </w:tblPrEx>
         <w:tc>
           <w:tcPr>
@@ -572,12 +560,6 @@
             <w:insideH w:val="single" w:color="auto" w:sz="4" w:space="0"/>
             <w:insideV w:val="single" w:color="auto" w:sz="4" w:space="0"/>
           </w:tblBorders>
-          <w:tblCellMar>
-            <w:top w:w="0" w:type="dxa"/>
-            <w:left w:w="108" w:type="dxa"/>
-            <w:bottom w:w="0" w:type="dxa"/>
-            <w:right w:w="108" w:type="dxa"/>
-          </w:tblCellMar>
         </w:tblPrEx>
         <w:tc>
           <w:tcPr>
@@ -1074,12 +1056,6 @@
             <w:insideH w:val="single" w:color="auto" w:sz="4" w:space="0"/>
             <w:insideV w:val="single" w:color="auto" w:sz="4" w:space="0"/>
           </w:tblBorders>
-          <w:tblCellMar>
-            <w:top w:w="0" w:type="dxa"/>
-            <w:left w:w="108" w:type="dxa"/>
-            <w:bottom w:w="0" w:type="dxa"/>
-            <w:right w:w="108" w:type="dxa"/>
-          </w:tblCellMar>
         </w:tblPrEx>
         <w:tc>
           <w:tcPr>
@@ -1933,12 +1909,6 @@
             <w:insideH w:val="single" w:color="auto" w:sz="4" w:space="0"/>
             <w:insideV w:val="single" w:color="auto" w:sz="4" w:space="0"/>
           </w:tblBorders>
-          <w:tblCellMar>
-            <w:top w:w="0" w:type="dxa"/>
-            <w:left w:w="108" w:type="dxa"/>
-            <w:bottom w:w="0" w:type="dxa"/>
-            <w:right w:w="108" w:type="dxa"/>
-          </w:tblCellMar>
         </w:tblPrEx>
         <w:tc>
           <w:tcPr>
@@ -2004,12 +1974,6 @@
             <w:insideH w:val="single" w:color="auto" w:sz="4" w:space="0"/>
             <w:insideV w:val="single" w:color="auto" w:sz="4" w:space="0"/>
           </w:tblBorders>
-          <w:tblCellMar>
-            <w:top w:w="0" w:type="dxa"/>
-            <w:left w:w="108" w:type="dxa"/>
-            <w:bottom w:w="0" w:type="dxa"/>
-            <w:right w:w="108" w:type="dxa"/>
-          </w:tblCellMar>
         </w:tblPrEx>
         <w:tc>
           <w:tcPr>
@@ -2074,12 +2038,6 @@
             <w:insideH w:val="single" w:color="auto" w:sz="4" w:space="0"/>
             <w:insideV w:val="single" w:color="auto" w:sz="4" w:space="0"/>
           </w:tblBorders>
-          <w:tblCellMar>
-            <w:top w:w="0" w:type="dxa"/>
-            <w:left w:w="108" w:type="dxa"/>
-            <w:bottom w:w="0" w:type="dxa"/>
-            <w:right w:w="108" w:type="dxa"/>
-          </w:tblCellMar>
         </w:tblPrEx>
         <w:tc>
           <w:tcPr>
@@ -2181,12 +2139,6 @@
             <w:insideH w:val="single" w:color="auto" w:sz="4" w:space="0"/>
             <w:insideV w:val="single" w:color="auto" w:sz="4" w:space="0"/>
           </w:tblBorders>
-          <w:tblCellMar>
-            <w:top w:w="0" w:type="dxa"/>
-            <w:left w:w="108" w:type="dxa"/>
-            <w:bottom w:w="0" w:type="dxa"/>
-            <w:right w:w="108" w:type="dxa"/>
-          </w:tblCellMar>
         </w:tblPrEx>
         <w:tc>
           <w:tcPr>
@@ -2657,6 +2609,12 @@
             <w:insideH w:val="single" w:color="auto" w:sz="4" w:space="0"/>
             <w:insideV w:val="single" w:color="auto" w:sz="4" w:space="0"/>
           </w:tblBorders>
+          <w:tblCellMar>
+            <w:top w:w="0" w:type="dxa"/>
+            <w:left w:w="108" w:type="dxa"/>
+            <w:bottom w:w="0" w:type="dxa"/>
+            <w:right w:w="108" w:type="dxa"/>
+          </w:tblCellMar>
         </w:tblPrEx>
         <w:tc>
           <w:tcPr>
@@ -2983,12 +2941,6 @@
             <w:insideH w:val="single" w:color="auto" w:sz="4" w:space="0"/>
             <w:insideV w:val="single" w:color="auto" w:sz="4" w:space="0"/>
           </w:tblBorders>
-          <w:tblCellMar>
-            <w:top w:w="0" w:type="dxa"/>
-            <w:left w:w="108" w:type="dxa"/>
-            <w:bottom w:w="0" w:type="dxa"/>
-            <w:right w:w="108" w:type="dxa"/>
-          </w:tblCellMar>
         </w:tblPrEx>
         <w:tc>
           <w:tcPr>
@@ -6908,6 +6860,200 @@
           <w:spacing w:val="7"/>
         </w:rPr>
       </w:pPr>
+      <w:bookmarkStart w:id="27" w:name="_GoBack"/>
+      <w:bookmarkEnd w:id="27"/>
+    </w:p>
+    <w:p>
+      <w:pPr>
+        <w:rPr>
+          <w:rFonts w:cs="华文中宋"/>
+          <w:bCs/>
+          <w:color w:val="FF0000"/>
+          <w:spacing w:val="7"/>
+        </w:rPr>
+      </w:pPr>
+    </w:p>
+    <w:p>
+      <w:pPr>
+        <w:outlineLvl w:val="0"/>
+        <w:rPr>
+          <w:rFonts w:cs="华文中宋"/>
+          <w:bCs/>
+          <w:color w:val="FF0000"/>
+          <w:spacing w:val="7"/>
+        </w:rPr>
+      </w:pPr>
+      <w:r>
+        <w:rPr>
+          <w:rFonts w:hint="eastAsia" w:cs="华文中宋"/>
+          <w:bCs/>
+          <w:color w:val="70AD47" w:themeColor="accent6"/>
+          <w:szCs w:val="24"/>
+          <w:lang w:val="en-US" w:eastAsia="zh-CN"/>
+          <w14:textFill>
+            <w14:solidFill>
+              <w14:schemeClr w14:val="accent6"/>
+            </w14:solidFill>
+          </w14:textFill>
+        </w:rPr>
+        <w:t>仿真IsaacSim</w:t>
+      </w:r>
+      <w:r>
+        <w:rPr>
+          <w:rFonts w:hint="eastAsia" w:cs="华文中宋"/>
+          <w:bCs/>
+          <w:color w:val="70AD47" w:themeColor="accent6"/>
+          <w:szCs w:val="24"/>
+          <w14:textFill>
+            <w14:solidFill>
+              <w14:schemeClr w14:val="accent6"/>
+            </w14:solidFill>
+          </w14:textFill>
+        </w:rPr>
+        <w:t>：</w:t>
+      </w:r>
+    </w:p>
+    <w:p>
+      <w:pPr>
+        <w:numPr>
+          <w:ilvl w:val="0"/>
+          <w:numId w:val="0"/>
+        </w:numPr>
+        <w:outlineLvl w:val="9"/>
+        <w:rPr>
+          <w:rFonts w:hint="eastAsia" w:cs="华文中宋"/>
+          <w:b/>
+          <w:bCs/>
+          <w:i w:val="0"/>
+          <w:caps w:val="0"/>
+          <w:color w:val="ED7D31" w:themeColor="accent2"/>
+          <w:spacing w:val="7"/>
+          <w:sz w:val="21"/>
+          <w:szCs w:val="21"/>
+          <w:u w:val="single"/>
+          <w:lang w:val="en-US" w:eastAsia="zh-CN"/>
+          <w14:textFill>
+            <w14:solidFill>
+              <w14:schemeClr w14:val="accent2"/>
+            </w14:solidFill>
+          </w14:textFill>
+        </w:rPr>
+      </w:pPr>
+      <w:r>
+        <w:rPr>
+          <w:rFonts w:hint="eastAsia" w:cs="华文中宋"/>
+          <w:b/>
+          <w:bCs/>
+          <w:i w:val="0"/>
+          <w:caps w:val="0"/>
+          <w:color w:val="ED7D31" w:themeColor="accent2"/>
+          <w:spacing w:val="7"/>
+          <w:sz w:val="21"/>
+          <w:szCs w:val="21"/>
+          <w:u w:val="single"/>
+          <w:lang w:val="en-US" w:eastAsia="zh-CN"/>
+          <w14:textFill>
+            <w14:solidFill>
+              <w14:schemeClr w14:val="accent2"/>
+            </w14:solidFill>
+          </w14:textFill>
+        </w:rPr>
+        <w:fldChar w:fldCharType="begin"/>
+      </w:r>
+      <w:r>
+        <w:rPr>
+          <w:rFonts w:hint="eastAsia" w:cs="华文中宋"/>
+          <w:b/>
+          <w:bCs/>
+          <w:i w:val="0"/>
+          <w:caps w:val="0"/>
+          <w:color w:val="ED7D31" w:themeColor="accent2"/>
+          <w:spacing w:val="7"/>
+          <w:sz w:val="21"/>
+          <w:szCs w:val="21"/>
+          <w:u w:val="single"/>
+          <w:lang w:val="en-US" w:eastAsia="zh-CN"/>
+          <w14:textFill>
+            <w14:solidFill>
+              <w14:schemeClr w14:val="accent2"/>
+            </w14:solidFill>
+          </w14:textFill>
+        </w:rPr>
+        <w:instrText xml:space="preserve"> HYPERLINK "https://docs.isaacsim.omniverse.nvidia.com/latest/installation/index.html" </w:instrText>
+      </w:r>
+      <w:r>
+        <w:rPr>
+          <w:rFonts w:hint="eastAsia" w:cs="华文中宋"/>
+          <w:b/>
+          <w:bCs/>
+          <w:i w:val="0"/>
+          <w:caps w:val="0"/>
+          <w:color w:val="ED7D31" w:themeColor="accent2"/>
+          <w:spacing w:val="7"/>
+          <w:sz w:val="21"/>
+          <w:szCs w:val="21"/>
+          <w:u w:val="single"/>
+          <w:lang w:val="en-US" w:eastAsia="zh-CN"/>
+          <w14:textFill>
+            <w14:solidFill>
+              <w14:schemeClr w14:val="accent2"/>
+            </w14:solidFill>
+          </w14:textFill>
+        </w:rPr>
+        <w:fldChar w:fldCharType="separate"/>
+      </w:r>
+      <w:r>
+        <w:rPr>
+          <w:rFonts w:hint="eastAsia" w:cs="华文中宋"/>
+          <w:b/>
+          <w:bCs/>
+          <w:i w:val="0"/>
+          <w:caps w:val="0"/>
+          <w:color w:val="ED7D31" w:themeColor="accent2"/>
+          <w:spacing w:val="7"/>
+          <w:sz w:val="21"/>
+          <w:szCs w:val="21"/>
+          <w:u w:val="single"/>
+          <w:lang w:val="en-US" w:eastAsia="zh-CN"/>
+          <w14:textFill>
+            <w14:solidFill>
+              <w14:schemeClr w14:val="accent2"/>
+            </w14:solidFill>
+          </w14:textFill>
+        </w:rPr>
+        <w:t>https://docs.isaacsim.omniverse.nvidia.com/latest/installation/index.html</w:t>
+      </w:r>
+      <w:r>
+        <w:rPr>
+          <w:rFonts w:hint="eastAsia" w:cs="华文中宋"/>
+          <w:b/>
+          <w:bCs/>
+          <w:i w:val="0"/>
+          <w:caps w:val="0"/>
+          <w:color w:val="ED7D31" w:themeColor="accent2"/>
+          <w:spacing w:val="7"/>
+          <w:sz w:val="21"/>
+          <w:szCs w:val="21"/>
+          <w:u w:val="single"/>
+          <w:lang w:val="en-US" w:eastAsia="zh-CN"/>
+          <w14:textFill>
+            <w14:solidFill>
+              <w14:schemeClr w14:val="accent2"/>
+            </w14:solidFill>
+          </w14:textFill>
+        </w:rPr>
+        <w:fldChar w:fldCharType="end"/>
+      </w:r>
+    </w:p>
+    <w:p>
+      <w:pPr>
+        <w:rPr>
+          <w:rFonts w:cs="华文中宋"/>
+          <w:bCs/>
+          <w:color w:val="FF0000"/>
+          <w:spacing w:val="7"/>
+        </w:rPr>
+      </w:pPr>
     </w:p>
     <w:p>
       <w:pPr>
@@ -7512,12 +7658,6 @@
             <w:insideH w:val="single" w:color="auto" w:sz="4" w:space="0"/>
             <w:insideV w:val="single" w:color="auto" w:sz="4" w:space="0"/>
           </w:tblBorders>
-          <w:tblCellMar>
-            <w:top w:w="0" w:type="dxa"/>
-            <w:left w:w="108" w:type="dxa"/>
-            <w:bottom w:w="0" w:type="dxa"/>
-            <w:right w:w="108" w:type="dxa"/>
-          </w:tblCellMar>
         </w:tblPrEx>
         <w:tc>
           <w:tcPr>
@@ -8211,12 +8351,6 @@
             <w:insideH w:val="single" w:color="auto" w:sz="4" w:space="0"/>
             <w:insideV w:val="single" w:color="auto" w:sz="4" w:space="0"/>
           </w:tblBorders>
-          <w:tblCellMar>
-            <w:top w:w="0" w:type="dxa"/>
-            <w:left w:w="108" w:type="dxa"/>
-            <w:bottom w:w="0" w:type="dxa"/>
-            <w:right w:w="108" w:type="dxa"/>
-          </w:tblCellMar>
         </w:tblPrEx>
         <w:tc>
           <w:tcPr>
@@ -13497,6 +13631,12 @@
             <w:insideH w:val="single" w:color="auto" w:sz="4" w:space="0"/>
             <w:insideV w:val="single" w:color="auto" w:sz="4" w:space="0"/>
           </w:tblBorders>
+          <w:tblCellMar>
+            <w:top w:w="0" w:type="dxa"/>
+            <w:left w:w="108" w:type="dxa"/>
+            <w:bottom w:w="0" w:type="dxa"/>
+            <w:right w:w="108" w:type="dxa"/>
+          </w:tblCellMar>
         </w:tblPrEx>
         <w:tc>
           <w:tcPr>
@@ -14953,6 +15093,12 @@
             <w:insideH w:val="single" w:color="auto" w:sz="4" w:space="0"/>
             <w:insideV w:val="single" w:color="auto" w:sz="4" w:space="0"/>
           </w:tblBorders>
+          <w:tblCellMar>
+            <w:top w:w="0" w:type="dxa"/>
+            <w:left w:w="108" w:type="dxa"/>
+            <w:bottom w:w="0" w:type="dxa"/>
+            <w:right w:w="108" w:type="dxa"/>
+          </w:tblCellMar>
         </w:tblPrEx>
         <w:tc>
           <w:tcPr>
@@ -17005,12 +17151,6 @@
             <w:insideH w:val="single" w:color="auto" w:sz="4" w:space="0"/>
             <w:insideV w:val="single" w:color="auto" w:sz="4" w:space="0"/>
           </w:tblBorders>
-          <w:tblCellMar>
-            <w:top w:w="0" w:type="dxa"/>
-            <w:left w:w="108" w:type="dxa"/>
-            <w:bottom w:w="0" w:type="dxa"/>
-            <w:right w:w="108" w:type="dxa"/>
-          </w:tblCellMar>
         </w:tblPrEx>
         <w:tc>
           <w:tcPr>
@@ -21992,12 +22132,6 @@
             <w:insideH w:val="single" w:color="auto" w:sz="4" w:space="0"/>
             <w:insideV w:val="single" w:color="auto" w:sz="4" w:space="0"/>
           </w:tblBorders>
-          <w:tblCellMar>
-            <w:top w:w="0" w:type="dxa"/>
-            <w:left w:w="108" w:type="dxa"/>
-            <w:bottom w:w="0" w:type="dxa"/>
-            <w:right w:w="108" w:type="dxa"/>
-          </w:tblCellMar>
         </w:tblPrEx>
         <w:tc>
           <w:tcPr>
@@ -22424,12 +22558,6 @@
             <w:insideH w:val="single" w:color="auto" w:sz="4" w:space="0"/>
             <w:insideV w:val="single" w:color="auto" w:sz="4" w:space="0"/>
           </w:tblBorders>
-          <w:tblCellMar>
-            <w:top w:w="0" w:type="dxa"/>
-            <w:left w:w="108" w:type="dxa"/>
-            <w:bottom w:w="0" w:type="dxa"/>
-            <w:right w:w="108" w:type="dxa"/>
-          </w:tblCellMar>
         </w:tblPrEx>
         <w:tc>
           <w:tcPr>
@@ -22872,12 +23000,6 @@
             <w:insideH w:val="single" w:color="auto" w:sz="4" w:space="0"/>
             <w:insideV w:val="single" w:color="auto" w:sz="4" w:space="0"/>
           </w:tblBorders>
-          <w:tblCellMar>
-            <w:top w:w="0" w:type="dxa"/>
-            <w:left w:w="108" w:type="dxa"/>
-            <w:bottom w:w="0" w:type="dxa"/>
-            <w:right w:w="108" w:type="dxa"/>
-          </w:tblCellMar>
         </w:tblPrEx>
         <w:tc>
           <w:tcPr>
@@ -24647,12 +24769,6 @@
             <w:insideH w:val="single" w:color="auto" w:sz="4" w:space="0"/>
             <w:insideV w:val="single" w:color="auto" w:sz="4" w:space="0"/>
           </w:tblBorders>
-          <w:tblCellMar>
-            <w:top w:w="0" w:type="dxa"/>
-            <w:left w:w="108" w:type="dxa"/>
-            <w:bottom w:w="0" w:type="dxa"/>
-            <w:right w:w="108" w:type="dxa"/>
-          </w:tblCellMar>
         </w:tblPrEx>
         <w:tc>
           <w:tcPr>
@@ -25994,6 +26110,12 @@
             <w:insideH w:val="single" w:color="auto" w:sz="4" w:space="0"/>
             <w:insideV w:val="single" w:color="auto" w:sz="4" w:space="0"/>
           </w:tblBorders>
+          <w:tblCellMar>
+            <w:top w:w="0" w:type="dxa"/>
+            <w:left w:w="108" w:type="dxa"/>
+            <w:bottom w:w="0" w:type="dxa"/>
+            <w:right w:w="108" w:type="dxa"/>
+          </w:tblCellMar>
         </w:tblPrEx>
         <w:tc>
           <w:tcPr>
@@ -28473,12 +28595,6 @@
             <w:insideH w:val="single" w:color="auto" w:sz="4" w:space="0"/>
             <w:insideV w:val="single" w:color="auto" w:sz="4" w:space="0"/>
           </w:tblBorders>
-          <w:tblCellMar>
-            <w:top w:w="0" w:type="dxa"/>
-            <w:left w:w="108" w:type="dxa"/>
-            <w:bottom w:w="0" w:type="dxa"/>
-            <w:right w:w="108" w:type="dxa"/>
-          </w:tblCellMar>
         </w:tblPrEx>
         <w:tc>
           <w:tcPr>
@@ -28639,8 +28755,8 @@
         <w:outlineLvl w:val="0"/>
       </w:pPr>
       <w:bookmarkStart w:id="16" w:name="_Toc7235"/>
-      <w:bookmarkStart w:id="17" w:name="_Toc15387"/>
-      <w:bookmarkStart w:id="18" w:name="_Toc17683"/>
+      <w:bookmarkStart w:id="17" w:name="_Toc17683"/>
+      <w:bookmarkStart w:id="18" w:name="_Toc15387"/>
       <w:r>
         <w:rPr>
           <w:rFonts w:hint="eastAsia" w:cs="华文中宋"/>
@@ -28694,6 +28810,12 @@
             <w:insideH w:val="single" w:color="auto" w:sz="4" w:space="0"/>
             <w:insideV w:val="single" w:color="auto" w:sz="4" w:space="0"/>
           </w:tblBorders>
+          <w:tblCellMar>
+            <w:top w:w="0" w:type="dxa"/>
+            <w:left w:w="108" w:type="dxa"/>
+            <w:bottom w:w="0" w:type="dxa"/>
+            <w:right w:w="108" w:type="dxa"/>
+          </w:tblCellMar>
         </w:tblPrEx>
         <w:tc>
           <w:tcPr>
@@ -33125,12 +33247,6 @@
             <w:insideH w:val="single" w:color="auto" w:sz="4" w:space="0"/>
             <w:insideV w:val="single" w:color="auto" w:sz="4" w:space="0"/>
           </w:tblBorders>
-          <w:tblCellMar>
-            <w:top w:w="0" w:type="dxa"/>
-            <w:left w:w="108" w:type="dxa"/>
-            <w:bottom w:w="0" w:type="dxa"/>
-            <w:right w:w="108" w:type="dxa"/>
-          </w:tblCellMar>
         </w:tblPrEx>
         <w:tc>
           <w:tcPr>
@@ -33763,12 +33879,6 @@
             <w:insideH w:val="single" w:color="auto" w:sz="4" w:space="0"/>
             <w:insideV w:val="single" w:color="auto" w:sz="4" w:space="0"/>
           </w:tblBorders>
-          <w:tblCellMar>
-            <w:top w:w="0" w:type="dxa"/>
-            <w:left w:w="108" w:type="dxa"/>
-            <w:bottom w:w="0" w:type="dxa"/>
-            <w:right w:w="108" w:type="dxa"/>
-          </w:tblCellMar>
         </w:tblPrEx>
         <w:tc>
           <w:tcPr>
@@ -35863,12 +35973,6 @@
             <w:insideH w:val="single" w:color="auto" w:sz="4" w:space="0"/>
             <w:insideV w:val="single" w:color="auto" w:sz="4" w:space="0"/>
           </w:tblBorders>
-          <w:tblCellMar>
-            <w:top w:w="0" w:type="dxa"/>
-            <w:left w:w="108" w:type="dxa"/>
-            <w:bottom w:w="0" w:type="dxa"/>
-            <w:right w:w="108" w:type="dxa"/>
-          </w:tblCellMar>
         </w:tblPrEx>
         <w:tc>
           <w:tcPr>
@@ -36521,6 +36625,12 @@
             <w:insideH w:val="single" w:color="auto" w:sz="4" w:space="0"/>
             <w:insideV w:val="single" w:color="auto" w:sz="4" w:space="0"/>
           </w:tblBorders>
+          <w:tblCellMar>
+            <w:top w:w="0" w:type="dxa"/>
+            <w:left w:w="108" w:type="dxa"/>
+            <w:bottom w:w="0" w:type="dxa"/>
+            <w:right w:w="108" w:type="dxa"/>
+          </w:tblCellMar>
         </w:tblPrEx>
         <w:tc>
           <w:tcPr>
@@ -37029,12 +37139,6 @@
             <w:insideH w:val="single" w:color="auto" w:sz="4" w:space="0"/>
             <w:insideV w:val="single" w:color="auto" w:sz="4" w:space="0"/>
           </w:tblBorders>
-          <w:tblCellMar>
-            <w:top w:w="0" w:type="dxa"/>
-            <w:left w:w="108" w:type="dxa"/>
-            <w:bottom w:w="0" w:type="dxa"/>
-            <w:right w:w="108" w:type="dxa"/>
-          </w:tblCellMar>
         </w:tblPrEx>
         <w:tc>
           <w:tcPr>
@@ -37288,12 +37392,6 @@
             <w:insideH w:val="single" w:color="auto" w:sz="4" w:space="0"/>
             <w:insideV w:val="single" w:color="auto" w:sz="4" w:space="0"/>
           </w:tblBorders>
-          <w:tblCellMar>
-            <w:top w:w="0" w:type="dxa"/>
-            <w:left w:w="108" w:type="dxa"/>
-            <w:bottom w:w="0" w:type="dxa"/>
-            <w:right w:w="108" w:type="dxa"/>
-          </w:tblCellMar>
         </w:tblPrEx>
         <w:tc>
           <w:tcPr>
@@ -38488,12 +38586,6 @@
             <w:insideH w:val="single" w:color="auto" w:sz="4" w:space="0"/>
             <w:insideV w:val="single" w:color="auto" w:sz="4" w:space="0"/>
           </w:tblBorders>
-          <w:tblCellMar>
-            <w:top w:w="0" w:type="dxa"/>
-            <w:left w:w="108" w:type="dxa"/>
-            <w:bottom w:w="0" w:type="dxa"/>
-            <w:right w:w="108" w:type="dxa"/>
-          </w:tblCellMar>
         </w:tblPrEx>
         <w:tc>
           <w:tcPr>
@@ -39281,12 +39373,6 @@
             <w:insideH w:val="single" w:color="auto" w:sz="4" w:space="0"/>
             <w:insideV w:val="single" w:color="auto" w:sz="4" w:space="0"/>
           </w:tblBorders>
-          <w:tblCellMar>
-            <w:top w:w="0" w:type="dxa"/>
-            <w:left w:w="108" w:type="dxa"/>
-            <w:bottom w:w="0" w:type="dxa"/>
-            <w:right w:w="108" w:type="dxa"/>
-          </w:tblCellMar>
         </w:tblPrEx>
         <w:tc>
           <w:tcPr>
@@ -40674,12 +40760,6 @@
             <w:insideH w:val="single" w:color="auto" w:sz="4" w:space="0"/>
             <w:insideV w:val="single" w:color="auto" w:sz="4" w:space="0"/>
           </w:tblBorders>
-          <w:tblCellMar>
-            <w:top w:w="0" w:type="dxa"/>
-            <w:left w:w="108" w:type="dxa"/>
-            <w:bottom w:w="0" w:type="dxa"/>
-            <w:right w:w="108" w:type="dxa"/>
-          </w:tblCellMar>
         </w:tblPrEx>
         <w:tc>
           <w:tcPr>
@@ -42014,6 +42094,12 @@
             <w:insideH w:val="single" w:color="auto" w:sz="4" w:space="0"/>
             <w:insideV w:val="single" w:color="auto" w:sz="4" w:space="0"/>
           </w:tblBorders>
+          <w:tblCellMar>
+            <w:top w:w="0" w:type="dxa"/>
+            <w:left w:w="108" w:type="dxa"/>
+            <w:bottom w:w="0" w:type="dxa"/>
+            <w:right w:w="108" w:type="dxa"/>
+          </w:tblCellMar>
         </w:tblPrEx>
         <w:tc>
           <w:tcPr>
@@ -44413,8 +44499,8 @@
           </w14:textFill>
         </w:rPr>
       </w:pPr>
-      <w:bookmarkStart w:id="23" w:name="_Toc12616"/>
-      <w:bookmarkStart w:id="24" w:name="_Toc14852"/>
+      <w:bookmarkStart w:id="23" w:name="_Toc14852"/>
+      <w:bookmarkStart w:id="24" w:name="_Toc12616"/>
       <w:r>
         <w:rPr>
           <w:rFonts w:hint="eastAsia" w:cs="华文中宋"/>

</xml_diff>

<commit_message>
update on 2025-06-29 01:19:56.117163
</commit_message>
<xml_diff>
--- a/py 系统交互.docx
+++ b/py 系统交互.docx
@@ -718,8 +718,8 @@
           </w14:textFill>
         </w:rPr>
       </w:pPr>
-      <w:bookmarkStart w:id="2" w:name="_Toc22979"/>
-      <w:bookmarkStart w:id="3" w:name="_Toc30515"/>
+      <w:bookmarkStart w:id="2" w:name="_Toc30515"/>
+      <w:bookmarkStart w:id="3" w:name="_Toc22979"/>
       <w:r>
         <w:rPr>
           <w:rFonts w:hint="eastAsia" w:cs="华文中宋"/>
@@ -6681,8 +6681,8 @@
           </w14:textFill>
         </w:rPr>
       </w:pPr>
-      <w:bookmarkStart w:id="4" w:name="_Toc18611"/>
-      <w:bookmarkStart w:id="5" w:name="_Toc18446"/>
+      <w:bookmarkStart w:id="4" w:name="_Toc18446"/>
+      <w:bookmarkStart w:id="5" w:name="_Toc18611"/>
       <w:r>
         <w:rPr>
           <w:rFonts w:hint="eastAsia" w:cs="华文中宋"/>
@@ -8218,7 +8218,6 @@
           <w:tcPr>
             <w:tcW w:w="0" w:type="auto"/>
             <w:vMerge w:val="continue"/>
-            <w:tcBorders/>
             <w:vAlign w:val="center"/>
           </w:tcPr>
           <w:p>
@@ -19848,6 +19847,12 @@
             <w:insideH w:val="single" w:color="auto" w:sz="4" w:space="0"/>
             <w:insideV w:val="single" w:color="auto" w:sz="4" w:space="0"/>
           </w:tblBorders>
+          <w:tblCellMar>
+            <w:top w:w="0" w:type="dxa"/>
+            <w:left w:w="108" w:type="dxa"/>
+            <w:bottom w:w="0" w:type="dxa"/>
+            <w:right w:w="108" w:type="dxa"/>
+          </w:tblCellMar>
         </w:tblPrEx>
         <w:tc>
           <w:tcPr>
@@ -30089,9 +30094,9 @@
       <w:pPr>
         <w:outlineLvl w:val="0"/>
       </w:pPr>
-      <w:bookmarkStart w:id="16" w:name="_Toc17683"/>
-      <w:bookmarkStart w:id="17" w:name="_Toc15387"/>
-      <w:bookmarkStart w:id="18" w:name="_Toc7235"/>
+      <w:bookmarkStart w:id="16" w:name="_Toc15387"/>
+      <w:bookmarkStart w:id="17" w:name="_Toc7235"/>
+      <w:bookmarkStart w:id="18" w:name="_Toc17683"/>
       <w:r>
         <w:rPr>
           <w:rFonts w:hint="eastAsia" w:cs="华文中宋"/>
@@ -40341,6 +40346,288 @@
         </w:tc>
       </w:tr>
     </w:tbl>
+    <w:p>
+      <w:pPr>
+        <w:rPr>
+          <w:rFonts w:cs="华文中宋"/>
+          <w:bCs/>
+          <w:color w:val="FF0000"/>
+          <w:spacing w:val="7"/>
+        </w:rPr>
+      </w:pPr>
+    </w:p>
+    <w:p>
+      <w:pPr>
+        <w:rPr>
+          <w:rFonts w:cs="华文中宋"/>
+          <w:bCs/>
+          <w:color w:val="FF0000"/>
+          <w:spacing w:val="7"/>
+        </w:rPr>
+      </w:pPr>
+    </w:p>
+    <w:p>
+      <w:pPr>
+        <w:pStyle w:val="3"/>
+        <w:bidi w:val="0"/>
+        <w:rPr>
+          <w:rFonts w:hint="default"/>
+          <w:lang w:val="en-US" w:eastAsia="zh-CN"/>
+        </w:rPr>
+      </w:pPr>
+      <w:r>
+        <w:rPr>
+          <w:rFonts w:hint="eastAsia"/>
+          <w:lang w:val="en-US" w:eastAsia="zh-CN"/>
+        </w:rPr>
+        <w:t>通信ros_numpy：</w:t>
+      </w:r>
+    </w:p>
+    <w:p>
+      <w:pPr>
+        <w:rPr>
+          <w:rFonts w:hint="eastAsia" w:cs="华文中宋"/>
+          <w:bCs/>
+          <w:color w:val="ED7D31" w:themeColor="accent2"/>
+          <w:spacing w:val="7"/>
+          <w:lang w:val="en-US" w:eastAsia="zh-CN"/>
+          <w14:textFill>
+            <w14:solidFill>
+              <w14:schemeClr w14:val="accent2"/>
+            </w14:solidFill>
+          </w14:textFill>
+        </w:rPr>
+      </w:pPr>
+      <w:r>
+        <w:rPr>
+          <w:rFonts w:hint="eastAsia" w:cs="华文中宋"/>
+          <w:bCs/>
+          <w:color w:val="ED7D31" w:themeColor="accent2"/>
+          <w:spacing w:val="7"/>
+          <w:lang w:val="en-US" w:eastAsia="zh-CN"/>
+          <w14:textFill>
+            <w14:solidFill>
+              <w14:schemeClr w14:val="accent2"/>
+            </w14:solidFill>
+          </w14:textFill>
+        </w:rPr>
+        <w:t>git+https://github.com/eric-wieser/ros_numpy</w:t>
+      </w:r>
+    </w:p>
+    <w:p>
+      <w:pPr>
+        <w:rPr>
+          <w:rFonts w:hint="default" w:cs="华文中宋"/>
+          <w:bCs/>
+          <w:color w:val="FF0000"/>
+          <w:spacing w:val="7"/>
+          <w:lang w:val="en-US" w:eastAsia="zh-CN"/>
+        </w:rPr>
+      </w:pPr>
+    </w:p>
+    <w:tbl>
+      <w:tblPr>
+        <w:tblStyle w:val="11"/>
+        <w:tblW w:w="0" w:type="auto"/>
+        <w:tblInd w:w="0" w:type="dxa"/>
+        <w:tblBorders>
+          <w:top w:val="single" w:color="auto" w:sz="4" w:space="0"/>
+          <w:left w:val="single" w:color="auto" w:sz="4" w:space="0"/>
+          <w:bottom w:val="single" w:color="auto" w:sz="4" w:space="0"/>
+          <w:right w:val="single" w:color="auto" w:sz="4" w:space="0"/>
+          <w:insideH w:val="single" w:color="auto" w:sz="4" w:space="0"/>
+          <w:insideV w:val="single" w:color="auto" w:sz="4" w:space="0"/>
+        </w:tblBorders>
+        <w:tblLayout w:type="autofit"/>
+        <w:tblCellMar>
+          <w:top w:w="0" w:type="dxa"/>
+          <w:left w:w="108" w:type="dxa"/>
+          <w:bottom w:w="0" w:type="dxa"/>
+          <w:right w:w="108" w:type="dxa"/>
+        </w:tblCellMar>
+      </w:tblPr>
+      <w:tblGrid>
+        <w:gridCol w:w="1812"/>
+        <w:gridCol w:w="1413"/>
+      </w:tblGrid>
+      <w:tr>
+        <w:tblPrEx>
+          <w:tblBorders>
+            <w:top w:val="single" w:color="auto" w:sz="4" w:space="0"/>
+            <w:left w:val="single" w:color="auto" w:sz="4" w:space="0"/>
+            <w:bottom w:val="single" w:color="auto" w:sz="4" w:space="0"/>
+            <w:right w:val="single" w:color="auto" w:sz="4" w:space="0"/>
+            <w:insideH w:val="single" w:color="auto" w:sz="4" w:space="0"/>
+            <w:insideV w:val="single" w:color="auto" w:sz="4" w:space="0"/>
+          </w:tblBorders>
+          <w:tblCellMar>
+            <w:top w:w="0" w:type="dxa"/>
+            <w:left w:w="108" w:type="dxa"/>
+            <w:bottom w:w="0" w:type="dxa"/>
+            <w:right w:w="108" w:type="dxa"/>
+          </w:tblCellMar>
+        </w:tblPrEx>
+        <w:tc>
+          <w:tcPr>
+            <w:tcW w:w="0" w:type="auto"/>
+            <w:vAlign w:val="center"/>
+          </w:tcPr>
+          <w:p>
+            <w:pPr>
+              <w:pStyle w:val="17"/>
+              <w:bidi w:val="0"/>
+              <w:jc w:val="both"/>
+              <w:rPr>
+                <w:rFonts w:hint="default"/>
+                <w:lang w:val="en-US" w:eastAsia="zh-CN"/>
+              </w:rPr>
+            </w:pPr>
+            <w:r>
+              <w:rPr>
+                <w:rFonts w:hint="eastAsia"/>
+                <w:lang w:val="en-US" w:eastAsia="zh-CN"/>
+              </w:rPr>
+              <w:t>msgify(msgT, x)</w:t>
+            </w:r>
+          </w:p>
+        </w:tc>
+        <w:tc>
+          <w:tcPr>
+            <w:tcW w:w="0" w:type="auto"/>
+            <w:vAlign w:val="center"/>
+          </w:tcPr>
+          <w:p>
+            <w:pPr>
+              <w:jc w:val="both"/>
+              <w:rPr>
+                <w:rFonts w:hint="default" w:cs="华文中宋"/>
+                <w:b/>
+                <w:bCs/>
+                <w:color w:val="EA82E5"/>
+                <w:kern w:val="2"/>
+                <w:sz w:val="21"/>
+                <w:szCs w:val="21"/>
+                <w:lang w:val="en-US" w:eastAsia="zh-CN" w:bidi="ar-SA"/>
+              </w:rPr>
+            </w:pPr>
+            <w:r>
+              <w:rPr>
+                <w:rFonts w:hint="eastAsia" w:cs="华文中宋"/>
+                <w:b/>
+                <w:bCs/>
+                <w:color w:val="EA82E5"/>
+                <w:kern w:val="2"/>
+                <w:sz w:val="21"/>
+                <w:szCs w:val="21"/>
+                <w:lang w:val="en-US" w:eastAsia="zh-CN" w:bidi="ar-SA"/>
+              </w:rPr>
+              <w:t>转为消息</w:t>
+            </w:r>
+          </w:p>
+        </w:tc>
+      </w:tr>
+      <w:tr>
+        <w:tblPrEx>
+          <w:tblBorders>
+            <w:top w:val="single" w:color="auto" w:sz="4" w:space="0"/>
+            <w:left w:val="single" w:color="auto" w:sz="4" w:space="0"/>
+            <w:bottom w:val="single" w:color="auto" w:sz="4" w:space="0"/>
+            <w:right w:val="single" w:color="auto" w:sz="4" w:space="0"/>
+            <w:insideH w:val="single" w:color="auto" w:sz="4" w:space="0"/>
+            <w:insideV w:val="single" w:color="auto" w:sz="4" w:space="0"/>
+          </w:tblBorders>
+          <w:tblCellMar>
+            <w:top w:w="0" w:type="dxa"/>
+            <w:left w:w="108" w:type="dxa"/>
+            <w:bottom w:w="0" w:type="dxa"/>
+            <w:right w:w="108" w:type="dxa"/>
+          </w:tblCellMar>
+        </w:tblPrEx>
+        <w:tc>
+          <w:tcPr>
+            <w:tcW w:w="0" w:type="auto"/>
+            <w:vAlign w:val="center"/>
+          </w:tcPr>
+          <w:p>
+            <w:pPr>
+              <w:pStyle w:val="17"/>
+              <w:bidi w:val="0"/>
+              <w:jc w:val="both"/>
+              <w:rPr>
+                <w:rFonts w:hint="default" w:ascii="华文中宋" w:hAnsi="华文中宋" w:eastAsia="华文中宋" w:cs="华文中宋"/>
+                <w:b/>
+                <w:bCs/>
+                <w:color w:val="FF0000"/>
+                <w:kern w:val="2"/>
+                <w:sz w:val="21"/>
+                <w:szCs w:val="21"/>
+                <w:lang w:val="en-US" w:eastAsia="zh-CN" w:bidi="ar-SA"/>
+              </w:rPr>
+            </w:pPr>
+            <w:r>
+              <w:rPr>
+                <w:rFonts w:hint="eastAsia"/>
+                <w:lang w:val="en-US" w:eastAsia="zh-CN"/>
+              </w:rPr>
+              <w:t>numpify(msg</w:t>
+            </w:r>
+            <w:bookmarkStart w:id="27" w:name="_GoBack"/>
+            <w:bookmarkEnd w:id="27"/>
+            <w:r>
+              <w:rPr>
+                <w:rFonts w:hint="eastAsia"/>
+                <w:lang w:val="en-US" w:eastAsia="zh-CN"/>
+              </w:rPr>
+              <w:t>)</w:t>
+            </w:r>
+          </w:p>
+        </w:tc>
+        <w:tc>
+          <w:tcPr>
+            <w:tcW w:w="0" w:type="auto"/>
+            <w:vAlign w:val="center"/>
+          </w:tcPr>
+          <w:p>
+            <w:pPr>
+              <w:jc w:val="both"/>
+              <w:rPr>
+                <w:rFonts w:hint="default" w:ascii="华文中宋" w:hAnsi="华文中宋" w:eastAsia="华文中宋" w:cs="华文中宋"/>
+                <w:b/>
+                <w:bCs/>
+                <w:color w:val="EA82E5"/>
+                <w:kern w:val="2"/>
+                <w:sz w:val="21"/>
+                <w:szCs w:val="21"/>
+                <w:lang w:val="en-US" w:eastAsia="zh-CN" w:bidi="ar-SA"/>
+              </w:rPr>
+            </w:pPr>
+            <w:r>
+              <w:rPr>
+                <w:rFonts w:hint="eastAsia" w:cs="华文中宋"/>
+                <w:b/>
+                <w:bCs/>
+                <w:color w:val="EA82E5"/>
+                <w:kern w:val="2"/>
+                <w:sz w:val="21"/>
+                <w:szCs w:val="21"/>
+                <w:lang w:val="en-US" w:eastAsia="zh-CN" w:bidi="ar-SA"/>
+              </w:rPr>
+              <w:t>转为numpy</w:t>
+            </w:r>
+          </w:p>
+        </w:tc>
+      </w:tr>
+    </w:tbl>
+    <w:p>
+      <w:pPr>
+        <w:rPr>
+          <w:rFonts w:cs="华文中宋"/>
+          <w:bCs/>
+          <w:color w:val="FF0000"/>
+          <w:spacing w:val="7"/>
+        </w:rPr>
+      </w:pPr>
+    </w:p>
     <w:p>
       <w:pPr>
         <w:rPr>

</xml_diff>

<commit_message>
update on 2025-07-09 18:54:37.594191
</commit_message>
<xml_diff>
--- a/py 系统交互.docx
+++ b/py 系统交互.docx
@@ -18,8 +18,8 @@
           </w14:textFill>
         </w:rPr>
       </w:pPr>
-      <w:bookmarkStart w:id="0" w:name="_Toc1708"/>
-      <w:bookmarkStart w:id="1" w:name="_Toc12288"/>
+      <w:bookmarkStart w:id="0" w:name="_Toc12288"/>
+      <w:bookmarkStart w:id="1" w:name="_Toc1708"/>
       <w:r>
         <w:rPr>
           <w:rFonts w:hint="eastAsia" w:cs="华文中宋"/>
@@ -2989,6 +2989,12 @@
             <w:insideH w:val="single" w:color="auto" w:sz="4" w:space="0"/>
             <w:insideV w:val="single" w:color="auto" w:sz="4" w:space="0"/>
           </w:tblBorders>
+          <w:tblCellMar>
+            <w:top w:w="0" w:type="dxa"/>
+            <w:left w:w="108" w:type="dxa"/>
+            <w:bottom w:w="0" w:type="dxa"/>
+            <w:right w:w="108" w:type="dxa"/>
+          </w:tblCellMar>
         </w:tblPrEx>
         <w:tc>
           <w:tcPr>
@@ -6031,12 +6037,6 @@
             <w:insideH w:val="single" w:color="auto" w:sz="4" w:space="0"/>
             <w:insideV w:val="single" w:color="auto" w:sz="4" w:space="0"/>
           </w:tblBorders>
-          <w:tblCellMar>
-            <w:top w:w="0" w:type="dxa"/>
-            <w:left w:w="108" w:type="dxa"/>
-            <w:bottom w:w="0" w:type="dxa"/>
-            <w:right w:w="108" w:type="dxa"/>
-          </w:tblCellMar>
         </w:tblPrEx>
         <w:tc>
           <w:tcPr>
@@ -6160,12 +6160,6 @@
             <w:insideH w:val="single" w:color="auto" w:sz="4" w:space="0"/>
             <w:insideV w:val="single" w:color="auto" w:sz="4" w:space="0"/>
           </w:tblBorders>
-          <w:tblCellMar>
-            <w:top w:w="0" w:type="dxa"/>
-            <w:left w:w="108" w:type="dxa"/>
-            <w:bottom w:w="0" w:type="dxa"/>
-            <w:right w:w="108" w:type="dxa"/>
-          </w:tblCellMar>
         </w:tblPrEx>
         <w:tc>
           <w:tcPr>
@@ -6506,12 +6500,6 @@
             <w:insideH w:val="single" w:color="auto" w:sz="4" w:space="0"/>
             <w:insideV w:val="single" w:color="auto" w:sz="4" w:space="0"/>
           </w:tblBorders>
-          <w:tblCellMar>
-            <w:top w:w="0" w:type="dxa"/>
-            <w:left w:w="108" w:type="dxa"/>
-            <w:bottom w:w="0" w:type="dxa"/>
-            <w:right w:w="108" w:type="dxa"/>
-          </w:tblCellMar>
         </w:tblPrEx>
         <w:tc>
           <w:tcPr>
@@ -6681,8 +6669,8 @@
           </w14:textFill>
         </w:rPr>
       </w:pPr>
-      <w:bookmarkStart w:id="4" w:name="_Toc18446"/>
-      <w:bookmarkStart w:id="5" w:name="_Toc18611"/>
+      <w:bookmarkStart w:id="4" w:name="_Toc18611"/>
+      <w:bookmarkStart w:id="5" w:name="_Toc18446"/>
       <w:r>
         <w:rPr>
           <w:rFonts w:hint="eastAsia" w:cs="华文中宋"/>
@@ -6735,12 +6723,6 @@
             <w:insideH w:val="single" w:color="auto" w:sz="4" w:space="0"/>
             <w:insideV w:val="single" w:color="auto" w:sz="4" w:space="0"/>
           </w:tblBorders>
-          <w:tblCellMar>
-            <w:top w:w="0" w:type="dxa"/>
-            <w:left w:w="108" w:type="dxa"/>
-            <w:bottom w:w="0" w:type="dxa"/>
-            <w:right w:w="108" w:type="dxa"/>
-          </w:tblCellMar>
         </w:tblPrEx>
         <w:trPr>
           <w:trHeight w:val="265" w:hRule="atLeast"/>
@@ -8393,8 +8375,8 @@
           </w14:textFill>
         </w:rPr>
       </w:pPr>
-      <w:bookmarkStart w:id="6" w:name="_Toc27725"/>
-      <w:bookmarkStart w:id="7" w:name="_Toc31407"/>
+      <w:bookmarkStart w:id="6" w:name="_Toc31407"/>
+      <w:bookmarkStart w:id="7" w:name="_Toc27725"/>
       <w:r>
         <w:rPr>
           <w:rFonts w:hint="eastAsia" w:cs="华文中宋"/>
@@ -8968,6 +8950,12 @@
             <w:insideH w:val="single" w:color="auto" w:sz="4" w:space="0"/>
             <w:insideV w:val="single" w:color="auto" w:sz="4" w:space="0"/>
           </w:tblBorders>
+          <w:tblCellMar>
+            <w:top w:w="0" w:type="dxa"/>
+            <w:left w:w="108" w:type="dxa"/>
+            <w:bottom w:w="0" w:type="dxa"/>
+            <w:right w:w="108" w:type="dxa"/>
+          </w:tblCellMar>
         </w:tblPrEx>
         <w:tc>
           <w:tcPr>
@@ -9661,6 +9649,12 @@
             <w:insideH w:val="single" w:color="auto" w:sz="4" w:space="0"/>
             <w:insideV w:val="single" w:color="auto" w:sz="4" w:space="0"/>
           </w:tblBorders>
+          <w:tblCellMar>
+            <w:top w:w="0" w:type="dxa"/>
+            <w:left w:w="108" w:type="dxa"/>
+            <w:bottom w:w="0" w:type="dxa"/>
+            <w:right w:w="108" w:type="dxa"/>
+          </w:tblCellMar>
         </w:tblPrEx>
         <w:tc>
           <w:tcPr>
@@ -14887,8 +14881,8 @@
           <w:lang w:val="en-US" w:eastAsia="zh-CN"/>
         </w:rPr>
       </w:pPr>
-      <w:bookmarkStart w:id="8" w:name="_Toc14497"/>
-      <w:bookmarkStart w:id="9" w:name="_Toc28515"/>
+      <w:bookmarkStart w:id="8" w:name="_Toc28515"/>
+      <w:bookmarkStart w:id="9" w:name="_Toc14497"/>
       <w:r>
         <w:rPr>
           <w:rFonts w:hint="eastAsia" w:cs="华文中宋"/>
@@ -15205,12 +15199,6 @@
             <w:insideH w:val="single" w:color="auto" w:sz="4" w:space="0"/>
             <w:insideV w:val="single" w:color="auto" w:sz="4" w:space="0"/>
           </w:tblBorders>
-          <w:tblCellMar>
-            <w:top w:w="0" w:type="dxa"/>
-            <w:left w:w="108" w:type="dxa"/>
-            <w:bottom w:w="0" w:type="dxa"/>
-            <w:right w:w="108" w:type="dxa"/>
-          </w:tblCellMar>
         </w:tblPrEx>
         <w:tc>
           <w:tcPr>
@@ -18461,6 +18449,12 @@
             <w:insideH w:val="single" w:color="auto" w:sz="4" w:space="0"/>
             <w:insideV w:val="single" w:color="auto" w:sz="4" w:space="0"/>
           </w:tblBorders>
+          <w:tblCellMar>
+            <w:top w:w="0" w:type="dxa"/>
+            <w:left w:w="108" w:type="dxa"/>
+            <w:bottom w:w="0" w:type="dxa"/>
+            <w:right w:w="108" w:type="dxa"/>
+          </w:tblCellMar>
         </w:tblPrEx>
         <w:tc>
           <w:tcPr>
@@ -21793,7 +21787,28 @@
                 <w:color w:val="FF0000"/>
                 <w:spacing w:val="7"/>
               </w:rPr>
-              <w:t>()</w:t>
+              <w:t>(</w:t>
+            </w:r>
+            <w:r>
+              <w:rPr>
+                <w:rFonts w:hint="eastAsia" w:cs="华文中宋"/>
+                <w:bCs/>
+                <w:color w:val="FF0000"/>
+                <w:spacing w:val="7"/>
+                <w:lang w:val="en-US" w:eastAsia="zh-CN"/>
+              </w:rPr>
+              <w:t>lock</w:t>
+            </w:r>
+            <w:bookmarkStart w:id="27" w:name="_GoBack"/>
+            <w:bookmarkEnd w:id="27"/>
+            <w:r>
+              <w:rPr>
+                <w:rFonts w:hint="eastAsia" w:cs="华文中宋"/>
+                <w:bCs/>
+                <w:color w:val="FF0000"/>
+                <w:spacing w:val="7"/>
+              </w:rPr>
+              <w:t>)</w:t>
             </w:r>
           </w:p>
         </w:tc>
@@ -27390,8 +27405,8 @@
           </w14:textFill>
         </w:rPr>
       </w:pPr>
-      <w:bookmarkStart w:id="13" w:name="_Toc23811"/>
-      <w:bookmarkStart w:id="14" w:name="_Toc10652"/>
+      <w:bookmarkStart w:id="13" w:name="_Toc10652"/>
+      <w:bookmarkStart w:id="14" w:name="_Toc23811"/>
       <w:r>
         <w:rPr>
           <w:rFonts w:hint="eastAsia" w:cs="华文中宋"/>
@@ -30583,12 +30598,6 @@
             <w:insideH w:val="single" w:color="auto" w:sz="4" w:space="0"/>
             <w:insideV w:val="single" w:color="auto" w:sz="4" w:space="0"/>
           </w:tblBorders>
-          <w:tblCellMar>
-            <w:top w:w="0" w:type="dxa"/>
-            <w:left w:w="108" w:type="dxa"/>
-            <w:bottom w:w="0" w:type="dxa"/>
-            <w:right w:w="108" w:type="dxa"/>
-          </w:tblCellMar>
         </w:tblPrEx>
         <w:tc>
           <w:tcPr>
@@ -37975,14 +37984,6 @@
       </w:tblGrid>
       <w:tr>
         <w:tblPrEx>
-          <w:tblBorders>
-            <w:top w:val="single" w:color="auto" w:sz="4" w:space="0"/>
-            <w:left w:val="single" w:color="auto" w:sz="4" w:space="0"/>
-            <w:bottom w:val="single" w:color="auto" w:sz="4" w:space="0"/>
-            <w:right w:val="single" w:color="auto" w:sz="4" w:space="0"/>
-            <w:insideH w:val="single" w:color="auto" w:sz="4" w:space="0"/>
-            <w:insideV w:val="single" w:color="auto" w:sz="4" w:space="0"/>
-          </w:tblBorders>
           <w:tblCellMar>
             <w:top w:w="0" w:type="dxa"/>
             <w:left w:w="108" w:type="dxa"/>
@@ -40569,16 +40570,7 @@
                 <w:rFonts w:hint="eastAsia"/>
                 <w:lang w:val="en-US" w:eastAsia="zh-CN"/>
               </w:rPr>
-              <w:t>numpify(msg</w:t>
-            </w:r>
-            <w:bookmarkStart w:id="27" w:name="_GoBack"/>
-            <w:bookmarkEnd w:id="27"/>
-            <w:r>
-              <w:rPr>
-                <w:rFonts w:hint="eastAsia"/>
-                <w:lang w:val="en-US" w:eastAsia="zh-CN"/>
-              </w:rPr>
-              <w:t>)</w:t>
+              <w:t>numpify(msg)</w:t>
             </w:r>
           </w:p>
         </w:tc>
@@ -41031,6 +41023,12 @@
             <w:insideH w:val="single" w:color="auto" w:sz="4" w:space="0"/>
             <w:insideV w:val="single" w:color="auto" w:sz="4" w:space="0"/>
           </w:tblBorders>
+          <w:tblCellMar>
+            <w:top w:w="0" w:type="dxa"/>
+            <w:left w:w="108" w:type="dxa"/>
+            <w:bottom w:w="0" w:type="dxa"/>
+            <w:right w:w="108" w:type="dxa"/>
+          </w:tblCellMar>
         </w:tblPrEx>
         <w:tc>
           <w:tcPr>
@@ -43702,8 +43700,8 @@
           <w:spacing w:val="7"/>
         </w:rPr>
       </w:pPr>
-      <w:bookmarkStart w:id="21" w:name="_Toc20558"/>
-      <w:bookmarkStart w:id="22" w:name="_Toc6828"/>
+      <w:bookmarkStart w:id="21" w:name="_Toc6828"/>
+      <w:bookmarkStart w:id="22" w:name="_Toc20558"/>
       <w:r>
         <w:rPr>
           <w:rFonts w:hint="eastAsia" w:cs="华文中宋"/>
@@ -46163,8 +46161,8 @@
           </w14:textFill>
         </w:rPr>
       </w:pPr>
-      <w:bookmarkStart w:id="23" w:name="_Toc12616"/>
-      <w:bookmarkStart w:id="24" w:name="_Toc14852"/>
+      <w:bookmarkStart w:id="23" w:name="_Toc14852"/>
+      <w:bookmarkStart w:id="24" w:name="_Toc12616"/>
       <w:r>
         <w:rPr>
           <w:rFonts w:hint="eastAsia" w:cs="华文中宋"/>
@@ -46915,8 +46913,8 @@
           </w14:textFill>
         </w:rPr>
       </w:pPr>
-      <w:bookmarkStart w:id="25" w:name="_Toc19183"/>
-      <w:bookmarkStart w:id="26" w:name="_Toc7657"/>
+      <w:bookmarkStart w:id="25" w:name="_Toc7657"/>
+      <w:bookmarkStart w:id="26" w:name="_Toc19183"/>
       <w:r>
         <w:rPr>
           <w:rFonts w:hint="eastAsia" w:cs="华文中宋"/>

</xml_diff>